<commit_message>
docs: update resume and add ys-basket interview guide
</commit_message>
<xml_diff>
--- a/agent-0829/agent简历3.0.docx
+++ b/agent-0829/agent简历3.0.docx
@@ -1583,6 +1583,251 @@
           <w:spacing w:val="0"/>
         </w:rPr>
         <w:t>通过 NDJSON 推送解析、转写和摘要阶段，区分超时、额度不足与内容缺失；设置输入和视频时长上限、实例内字幕缓存及 IP 限流。</w:t>
+      </w:r>
+    </w:p>
+    <w:p>
+      <w:pPr>
+        <w:pStyle w:val="1"/>
+        <w:keepLines w:val="1"/>
+        <w:pageBreakBefore/>
+        <w:widowControl/>
+        <w:snapToGrid w:val="0"/>
+        <w:spacing w:before="0" w:after="80" w:line="360" w:lineRule="exact"/>
+        <w:ind w:left="0" w:right="0" w:firstLine="0"/>
+        <w:keepNext w:val="1"/>
+        <w:snapToGrid w:val="0"/>
+      </w:pPr>
+      <w:r>
+        <w:rPr>
+          <w:rFonts w:ascii="Arial" w:hAnsi="Arial" w:eastAsia="Microsoft YaHei" w:cs="Arial"/>
+          <w:sz w:val="24"/>
+          <w:szCs w:val="24"/>
+          <w:color w:val="000000"/>
+          <w:lang w:val="en-US" w:eastAsia="zh-CN"/>
+          <w:b w:val="1"/>
+          <w:bCs w:val="1"/>
+          <w:spacing w:val="0"/>
+        </w:rPr>
+        <w:t>拾味篮子  微信小程序订购与提货平台</w:t>
+      </w:r>
+    </w:p>
+    <w:p>
+      <w:pPr>
+        <w:pStyle w:val="1"/>
+        <w:keepLines w:val="1"/>
+        <w:pageBreakBefore w:val="0"/>
+        <w:widowControl/>
+        <w:snapToGrid w:val="0"/>
+        <w:spacing w:before="0" w:after="60" w:line="280" w:lineRule="exact"/>
+        <w:ind w:left="0" w:right="0" w:firstLine="0"/>
+        <w:keepNext w:val="1"/>
+        <w:snapToGrid w:val="0"/>
+      </w:pPr>
+      <w:r>
+        <w:rPr>
+          <w:rFonts w:ascii="Arial" w:hAnsi="Arial" w:eastAsia="Microsoft YaHei" w:cs="Arial"/>
+          <w:sz w:val="18"/>
+          <w:szCs w:val="18"/>
+          <w:color w:val="666666"/>
+          <w:lang w:val="en-US" w:eastAsia="zh-CN"/>
+          <w:b w:val="0"/>
+          <w:bCs w:val="0"/>
+          <w:spacing w:val="0"/>
+        </w:rPr>
+        <w:t>前端开发  |  uni-app / Vue 3 / TypeScript / Pinia / Wot Design Uni</w:t>
+      </w:r>
+    </w:p>
+    <w:p>
+      <w:pPr>
+        <w:pStyle w:val="1"/>
+        <w:keepLines w:val="1"/>
+        <w:pageBreakBefore w:val="0"/>
+        <w:widowControl/>
+        <w:snapToGrid w:val="0"/>
+        <w:spacing w:before="0" w:after="65" w:line="330" w:lineRule="exact"/>
+        <w:ind w:left="0" w:right="0" w:firstLine="0"/>
+        <w:snapToGrid w:val="0"/>
+        <w:keepNext w:val="0"/>
+      </w:pPr>
+      <w:r>
+        <w:rPr>
+          <w:sz w:val="21"/>
+          <w:rFonts w:ascii="Arial" w:hAnsi="Arial" w:eastAsia="Microsoft YaHei" w:cs="Arial"/>
+          <w:szCs w:val="21"/>
+          <w:color w:val="252525"/>
+          <w:b w:val="0"/>
+          <w:bCs w:val="0"/>
+          <w:spacing w:val="0"/>
+        </w:rPr>
+        <w:t>面向食品订购与库存提货场景，串联商品选购、购物车结算、微信支付、发货与订单查询，配套合伙人邀请、佣金提现及电子发票功能。</w:t>
+      </w:r>
+    </w:p>
+    <w:p>
+      <w:pPr>
+        <w:pStyle w:val="1"/>
+        <w:keepLines w:val="1"/>
+        <w:pageBreakBefore w:val="0"/>
+        <w:widowControl/>
+        <w:snapToGrid w:val="0"/>
+        <w:spacing w:before="0" w:after="65" w:line="330" w:lineRule="exact"/>
+        <w:ind w:left="215" w:hanging="215"/>
+        <w:tabs>
+          <w:tab w:val="left" w:pos="215"/>
+        </w:tabs>
+        <w:snapToGrid w:val="0"/>
+        <w:keepNext w:val="0"/>
+      </w:pPr>
+      <w:r>
+        <w:rPr>
+          <w:sz w:val="21"/>
+          <w:rFonts w:ascii="Arial" w:hAnsi="Arial" w:eastAsia="Microsoft YaHei" w:cs="Arial"/>
+          <w:szCs w:val="21"/>
+          <w:color w:val="252525"/>
+          <w:b/>
+          <w:bCs w:val="0"/>
+          <w:spacing w:val="0"/>
+        </w:rPr>
+        <w:t>•</w:t>
+        <w:tab/>
+        <w:t>交易流程：</w:t>
+      </w:r>
+      <w:r>
+        <w:rPr>
+          <w:sz w:val="21"/>
+          <w:rFonts w:ascii="Arial" w:hAnsi="Arial" w:eastAsia="Microsoft YaHei" w:cs="Arial"/>
+          <w:szCs w:val="21"/>
+          <w:color w:val="252525"/>
+          <w:b w:val="0"/>
+          <w:bCs w:val="0"/>
+          <w:spacing w:val="0"/>
+        </w:rPr>
+        <w:t>实现立即购买与购物车结算，处理渠道优惠、优惠券及运费券规则；封装微信支付与未支付订单再次支付，区分取消和失败，通过提交锁避免页面重复发起下单。</w:t>
+      </w:r>
+    </w:p>
+    <w:p>
+      <w:pPr>
+        <w:pStyle w:val="1"/>
+        <w:keepLines w:val="1"/>
+        <w:pageBreakBefore w:val="0"/>
+        <w:widowControl/>
+        <w:snapToGrid w:val="0"/>
+        <w:spacing w:before="0" w:after="65" w:line="330" w:lineRule="exact"/>
+        <w:ind w:left="215" w:hanging="215"/>
+        <w:tabs>
+          <w:tab w:val="left" w:pos="215"/>
+        </w:tabs>
+        <w:snapToGrid w:val="0"/>
+        <w:keepNext w:val="0"/>
+      </w:pPr>
+      <w:r>
+        <w:rPr>
+          <w:sz w:val="21"/>
+          <w:rFonts w:ascii="Arial" w:hAnsi="Arial" w:eastAsia="Microsoft YaHei" w:cs="Arial"/>
+          <w:szCs w:val="21"/>
+          <w:color w:val="252525"/>
+          <w:b/>
+          <w:bCs w:val="0"/>
+          <w:spacing w:val="0"/>
+        </w:rPr>
+        <w:t>•</w:t>
+        <w:tab/>
+        <w:t>登录态管理：</w:t>
+      </w:r>
+      <w:r>
+        <w:rPr>
+          <w:sz w:val="21"/>
+          <w:rFonts w:ascii="Arial" w:hAnsi="Arial" w:eastAsia="Microsoft YaHei" w:cs="Arial"/>
+          <w:szCs w:val="21"/>
+          <w:color w:val="252525"/>
+          <w:b w:val="0"/>
+          <w:bCs w:val="0"/>
+          <w:spacing w:val="0"/>
+        </w:rPr>
+        <w:t>封装请求鉴权与导航守卫，支持公开页浏览、受限页登录拦截及登录后回跳；并发失效请求统一提示与跳转，核对请求所属会话，防止旧请求误清除新账号登录态。</w:t>
+      </w:r>
+    </w:p>
+    <w:p>
+      <w:pPr>
+        <w:pStyle w:val="1"/>
+        <w:keepLines w:val="1"/>
+        <w:pageBreakBefore w:val="0"/>
+        <w:widowControl/>
+        <w:snapToGrid w:val="0"/>
+        <w:spacing w:before="0" w:after="65" w:line="330" w:lineRule="exact"/>
+        <w:ind w:left="215" w:hanging="215"/>
+        <w:tabs>
+          <w:tab w:val="left" w:pos="215"/>
+        </w:tabs>
+        <w:snapToGrid w:val="0"/>
+        <w:keepNext w:val="0"/>
+      </w:pPr>
+      <w:r>
+        <w:rPr>
+          <w:sz w:val="21"/>
+          <w:rFonts w:ascii="Arial" w:hAnsi="Arial" w:eastAsia="Microsoft YaHei" w:cs="Arial"/>
+          <w:szCs w:val="21"/>
+          <w:color w:val="252525"/>
+          <w:b/>
+          <w:bCs w:val="0"/>
+          <w:spacing w:val="0"/>
+        </w:rPr>
+        <w:t>•</w:t>
+        <w:tab/>
+        <w:t>数据精度：</w:t>
+      </w:r>
+      <w:r>
+        <w:rPr>
+          <w:sz w:val="21"/>
+          <w:rFonts w:ascii="Arial" w:hAnsi="Arial" w:eastAsia="Microsoft YaHei" w:cs="Arial"/>
+          <w:szCs w:val="21"/>
+          <w:color w:val="252525"/>
+          <w:b w:val="0"/>
+          <w:bCs w:val="0"/>
+          <w:spacing w:val="0"/>
+        </w:rPr>
+        <w:t>以原始文本接收接口响应，将 ID 和订单号统一为字符串；对超出安全整数范围的字段按需使用 json-bigint 恢复精度，拦截无法安全传递的数值，避免标识尾数丢失。</w:t>
+      </w:r>
+    </w:p>
+    <w:p>
+      <w:pPr>
+        <w:pStyle w:val="1"/>
+        <w:keepLines w:val="1"/>
+        <w:pageBreakBefore w:val="0"/>
+        <w:widowControl/>
+        <w:snapToGrid w:val="0"/>
+        <w:spacing w:before="0" w:after="65" w:line="330" w:lineRule="exact"/>
+        <w:ind w:left="215" w:hanging="215"/>
+        <w:tabs>
+          <w:tab w:val="left" w:pos="215"/>
+        </w:tabs>
+        <w:snapToGrid w:val="0"/>
+        <w:keepNext w:val="0"/>
+      </w:pPr>
+      <w:r>
+        <w:rPr>
+          <w:sz w:val="21"/>
+          <w:rFonts w:ascii="Arial" w:hAnsi="Arial" w:eastAsia="Microsoft YaHei" w:cs="Arial"/>
+          <w:szCs w:val="21"/>
+          <w:color w:val="252525"/>
+          <w:b/>
+          <w:bCs w:val="0"/>
+          <w:spacing w:val="0"/>
+        </w:rPr>
+        <w:t>•</w:t>
+        <w:tab/>
+        <w:t>跨端衔接：</w:t>
+      </w:r>
+      <w:r>
+        <w:rPr>
+          <w:sz w:val="21"/>
+          <w:rFonts w:ascii="Arial" w:hAnsi="Arial" w:eastAsia="Microsoft YaHei" w:cs="Arial"/>
+          <w:szCs w:val="21"/>
+          <w:color w:val="252525"/>
+          <w:b w:val="0"/>
+          <w:bCs w:val="0"/>
+          <w:spacing w:val="0"/>
+        </w:rPr>
+        <w:t>实现小程序拉起 App 的平台分流：iOS 通过 web-view、JSSDK 签名及微信开放标签唤起；Android 引导外部浏览器使用 Intent，并为未安装或唤起失败提供下载兜底。</w:t>
       </w:r>
     </w:p>
     <w:sectPr>

</xml_diff>